<commit_message>
PO wise data found from ERP
</commit_message>
<xml_diff>
--- a/ATS_Commercial.docx
+++ b/ATS_Commercial.docx
@@ -162,7 +162,7 @@
           <w:color w:val="94A3B8"/>
           <w:sz w:val="18"/>
         </w:rPr>
-        <w:t>Prepared: 25 July 2026</w:t>
+        <w:t>Prepared: 12 August 2026</w:t>
       </w:r>
     </w:p>
     <w:p>
@@ -438,6 +438,125 @@
         <w:t>Final freight and forwarding document capturing shipping details and freight forwarder information.</w:t>
       </w:r>
     </w:p>
+    <w:p/>
+    <w:p>
+      <w:pPr>
+        <w:spacing w:after="120" w:before="80"/>
+      </w:pPr>
+      <w:r>
+        <w:rPr>
+          <w:b/>
+          <w:color w:val="16A34A"/>
+          <w:sz w:val="26"/>
+        </w:rPr>
+        <w:t>What's New</w:t>
+      </w:r>
+    </w:p>
+    <w:p>
+      <w:pPr>
+        <w:pStyle w:val="ListBullet"/>
+        <w:spacing w:after="80"/>
+      </w:pPr>
+      <w:r>
+        <w:rPr>
+          <w:b/>
+          <w:color w:val="16A34A"/>
+          <w:sz w:val="18"/>
+        </w:rPr>
+        <w:t xml:space="preserve">NEW  </w:t>
+      </w:r>
+      <w:r>
+        <w:rPr>
+          <w:color w:val="475569"/>
+          <w:sz w:val="22"/>
+        </w:rPr>
+        <w:t>You can now create an order directly from the PI page — click "+ New Order" and the order starts right there, no need to go through Marketing Intake first.</w:t>
+      </w:r>
+    </w:p>
+    <w:p>
+      <w:pPr>
+        <w:pStyle w:val="ListBullet"/>
+        <w:spacing w:after="80"/>
+      </w:pPr>
+      <w:r>
+        <w:rPr>
+          <w:b/>
+          <w:color w:val="16A34A"/>
+          <w:sz w:val="18"/>
+        </w:rPr>
+        <w:t xml:space="preserve">NEW  </w:t>
+      </w:r>
+      <w:r>
+        <w:rPr>
+          <w:color w:val="475569"/>
+          <w:sz w:val="22"/>
+        </w:rPr>
+        <w:t>The Customer field is now a single searchable box — just start typing the customer name and matching companies appear instantly.</w:t>
+      </w:r>
+    </w:p>
+    <w:p>
+      <w:pPr>
+        <w:pStyle w:val="ListBullet"/>
+        <w:spacing w:after="80"/>
+      </w:pPr>
+      <w:r>
+        <w:rPr>
+          <w:b/>
+          <w:color w:val="16A34A"/>
+          <w:sz w:val="18"/>
+        </w:rPr>
+        <w:t xml:space="preserve">NEW  </w:t>
+      </w:r>
+      <w:r>
+        <w:rPr>
+          <w:color w:val="475569"/>
+          <w:sz w:val="22"/>
+        </w:rPr>
+        <w:t>Loading a PO now auto-fills the Customer (TO) from the ERP, so the customer flows through to the order and the dashboard.</w:t>
+      </w:r>
+    </w:p>
+    <w:p>
+      <w:pPr>
+        <w:pStyle w:val="ListBullet"/>
+        <w:spacing w:after="80"/>
+      </w:pPr>
+      <w:r>
+        <w:rPr>
+          <w:b/>
+          <w:color w:val="16A34A"/>
+          <w:sz w:val="18"/>
+        </w:rPr>
+        <w:t xml:space="preserve">NEW  </w:t>
+      </w:r>
+      <w:r>
+        <w:rPr>
+          <w:color w:val="475569"/>
+          <w:sz w:val="22"/>
+        </w:rPr>
+        <w:t>Submitting a PI now records the customer, buyer and PO on the order, so the Order Tracking Dashboard shows PO, buyer and item count instead of blanks.</w:t>
+      </w:r>
+    </w:p>
+    <w:p>
+      <w:pPr>
+        <w:pStyle w:val="ListBullet"/>
+        <w:spacing w:after="80"/>
+      </w:pPr>
+      <w:r>
+        <w:rPr>
+          <w:b/>
+          <w:color w:val="16A34A"/>
+          <w:sz w:val="18"/>
+        </w:rPr>
+        <w:t xml:space="preserve">NEW  </w:t>
+      </w:r>
+      <w:r>
+        <w:rPr>
+          <w:color w:val="475569"/>
+          <w:sz w:val="22"/>
+        </w:rPr>
+        <w:t>Workflow after the PI: once the PI is submitted the order goes to Marketing for approval; after Marketing approves, it comes back to the LC step for you to record the Letter of Credit.</w:t>
+      </w:r>
+    </w:p>
     <w:p>
       <w:r>
         <w:br w:type="page"/>
@@ -507,7 +626,7 @@
       <w:r>
         <w:drawing>
           <wp:inline xmlns:a="http://schemas.openxmlformats.org/drawingml/2006/main" xmlns:pic="http://schemas.openxmlformats.org/drawingml/2006/picture">
-            <wp:extent cx="5303520" cy="7859522"/>
+            <wp:extent cx="5303520" cy="3314700"/>
             <wp:docPr id="1" name="Picture 1"/>
             <wp:cNvGraphicFramePr>
               <a:graphicFrameLocks noChangeAspect="1"/>
@@ -528,7 +647,7 @@
                   <pic:spPr>
                     <a:xfrm>
                       <a:off x="0" y="0"/>
-                      <a:ext cx="5303520" cy="7859522"/>
+                      <a:ext cx="5303520" cy="3314700"/>
                     </a:xfrm>
                     <a:prstGeom prst="rect"/>
                   </pic:spPr>
@@ -583,7 +702,7 @@
       <w:r>
         <w:drawing>
           <wp:inline xmlns:a="http://schemas.openxmlformats.org/drawingml/2006/main" xmlns:pic="http://schemas.openxmlformats.org/drawingml/2006/picture">
-            <wp:extent cx="5303520" cy="4695825"/>
+            <wp:extent cx="5303520" cy="6618351"/>
             <wp:docPr id="2" name="Picture 2"/>
             <wp:cNvGraphicFramePr>
               <a:graphicFrameLocks noChangeAspect="1"/>
@@ -604,7 +723,7 @@
                   <pic:spPr>
                     <a:xfrm>
                       <a:off x="0" y="0"/>
-                      <a:ext cx="5303520" cy="4695825"/>
+                      <a:ext cx="5303520" cy="6618351"/>
                     </a:xfrm>
                     <a:prstGeom prst="rect"/>
                   </pic:spPr>
@@ -659,7 +778,7 @@
       <w:r>
         <w:drawing>
           <wp:inline xmlns:a="http://schemas.openxmlformats.org/drawingml/2006/main" xmlns:pic="http://schemas.openxmlformats.org/drawingml/2006/picture">
-            <wp:extent cx="5303520" cy="6437884"/>
+            <wp:extent cx="5303520" cy="7207631"/>
             <wp:docPr id="3" name="Picture 3"/>
             <wp:cNvGraphicFramePr>
               <a:graphicFrameLocks noChangeAspect="1"/>
@@ -680,7 +799,7 @@
                   <pic:spPr>
                     <a:xfrm>
                       <a:off x="0" y="0"/>
-                      <a:ext cx="5303520" cy="6437884"/>
+                      <a:ext cx="5303520" cy="7207631"/>
                     </a:xfrm>
                     <a:prstGeom prst="rect"/>
                   </pic:spPr>
@@ -735,7 +854,7 @@
       <w:r>
         <w:drawing>
           <wp:inline xmlns:a="http://schemas.openxmlformats.org/drawingml/2006/main" xmlns:pic="http://schemas.openxmlformats.org/drawingml/2006/picture">
-            <wp:extent cx="5303520" cy="11299444"/>
+            <wp:extent cx="5303520" cy="8463534"/>
             <wp:docPr id="4" name="Picture 4"/>
             <wp:cNvGraphicFramePr>
               <a:graphicFrameLocks noChangeAspect="1"/>
@@ -756,7 +875,7 @@
                   <pic:spPr>
                     <a:xfrm>
                       <a:off x="0" y="0"/>
-                      <a:ext cx="5303520" cy="11299444"/>
+                      <a:ext cx="5303520" cy="8463534"/>
                     </a:xfrm>
                     <a:prstGeom prst="rect"/>
                   </pic:spPr>
@@ -811,7 +930,7 @@
       <w:r>
         <w:drawing>
           <wp:inline xmlns:a="http://schemas.openxmlformats.org/drawingml/2006/main" xmlns:pic="http://schemas.openxmlformats.org/drawingml/2006/picture">
-            <wp:extent cx="5303520" cy="7896352"/>
+            <wp:extent cx="5303520" cy="4577969"/>
             <wp:docPr id="5" name="Picture 5"/>
             <wp:cNvGraphicFramePr>
               <a:graphicFrameLocks noChangeAspect="1"/>
@@ -832,7 +951,7 @@
                   <pic:spPr>
                     <a:xfrm>
                       <a:off x="0" y="0"/>
-                      <a:ext cx="5303520" cy="7896352"/>
+                      <a:ext cx="5303520" cy="4577969"/>
                     </a:xfrm>
                     <a:prstGeom prst="rect"/>
                   </pic:spPr>
@@ -887,7 +1006,7 @@
       <w:r>
         <w:drawing>
           <wp:inline xmlns:a="http://schemas.openxmlformats.org/drawingml/2006/main" xmlns:pic="http://schemas.openxmlformats.org/drawingml/2006/picture">
-            <wp:extent cx="5303520" cy="8386191"/>
+            <wp:extent cx="5303520" cy="5067808"/>
             <wp:docPr id="6" name="Picture 6"/>
             <wp:cNvGraphicFramePr>
               <a:graphicFrameLocks noChangeAspect="1"/>
@@ -908,7 +1027,7 @@
                   <pic:spPr>
                     <a:xfrm>
                       <a:off x="0" y="0"/>
-                      <a:ext cx="5303520" cy="8386191"/>
+                      <a:ext cx="5303520" cy="5067808"/>
                     </a:xfrm>
                     <a:prstGeom prst="rect"/>
                   </pic:spPr>
@@ -963,7 +1082,7 @@
       <w:r>
         <w:drawing>
           <wp:inline xmlns:a="http://schemas.openxmlformats.org/drawingml/2006/main" xmlns:pic="http://schemas.openxmlformats.org/drawingml/2006/picture">
-            <wp:extent cx="5303520" cy="8028940"/>
+            <wp:extent cx="5303520" cy="4710557"/>
             <wp:docPr id="7" name="Picture 7"/>
             <wp:cNvGraphicFramePr>
               <a:graphicFrameLocks noChangeAspect="1"/>
@@ -984,7 +1103,7 @@
                   <pic:spPr>
                     <a:xfrm>
                       <a:off x="0" y="0"/>
-                      <a:ext cx="5303520" cy="8028940"/>
+                      <a:ext cx="5303520" cy="4710557"/>
                     </a:xfrm>
                     <a:prstGeom prst="rect"/>
                   </pic:spPr>
@@ -1039,7 +1158,7 @@
       <w:r>
         <w:drawing>
           <wp:inline xmlns:a="http://schemas.openxmlformats.org/drawingml/2006/main" xmlns:pic="http://schemas.openxmlformats.org/drawingml/2006/picture">
-            <wp:extent cx="5303520" cy="4051300"/>
+            <wp:extent cx="5303520" cy="3314700"/>
             <wp:docPr id="8" name="Picture 8"/>
             <wp:cNvGraphicFramePr>
               <a:graphicFrameLocks noChangeAspect="1"/>
@@ -1060,7 +1179,7 @@
                   <pic:spPr>
                     <a:xfrm>
                       <a:off x="0" y="0"/>
-                      <a:ext cx="5303520" cy="4051300"/>
+                      <a:ext cx="5303520" cy="3314700"/>
                     </a:xfrm>
                     <a:prstGeom prst="rect"/>
                   </pic:spPr>
@@ -1115,7 +1234,7 @@
       <w:r>
         <w:drawing>
           <wp:inline xmlns:a="http://schemas.openxmlformats.org/drawingml/2006/main" xmlns:pic="http://schemas.openxmlformats.org/drawingml/2006/picture">
-            <wp:extent cx="5303520" cy="4021836"/>
+            <wp:extent cx="5303520" cy="3314700"/>
             <wp:docPr id="9" name="Picture 9"/>
             <wp:cNvGraphicFramePr>
               <a:graphicFrameLocks noChangeAspect="1"/>
@@ -1136,7 +1255,7 @@
                   <pic:spPr>
                     <a:xfrm>
                       <a:off x="0" y="0"/>
-                      <a:ext cx="5303520" cy="4021836"/>
+                      <a:ext cx="5303520" cy="3314700"/>
                     </a:xfrm>
                     <a:prstGeom prst="rect"/>
                   </pic:spPr>
@@ -1191,7 +1310,7 @@
       <w:r>
         <w:drawing>
           <wp:inline xmlns:a="http://schemas.openxmlformats.org/drawingml/2006/main" xmlns:pic="http://schemas.openxmlformats.org/drawingml/2006/picture">
-            <wp:extent cx="5303520" cy="5848604"/>
+            <wp:extent cx="5303520" cy="5800725"/>
             <wp:docPr id="10" name="Picture 10"/>
             <wp:cNvGraphicFramePr>
               <a:graphicFrameLocks noChangeAspect="1"/>
@@ -1212,7 +1331,7 @@
                   <pic:spPr>
                     <a:xfrm>
                       <a:off x="0" y="0"/>
-                      <a:ext cx="5303520" cy="5848604"/>
+                      <a:ext cx="5303520" cy="5800725"/>
                     </a:xfrm>
                     <a:prstGeom prst="rect"/>
                   </pic:spPr>
@@ -1266,7 +1385,7 @@
           <w:color w:val="C8C8D2"/>
           <w:sz w:val="18"/>
         </w:rPr>
-        <w:t>For: Commercial Officer  ·  25 July 2026  ·  Confidential</w:t>
+        <w:t>For: Commercial Officer  ·  12 August 2026  ·  Confidential</w:t>
       </w:r>
     </w:p>
     <w:sectPr>

</xml_diff>